<commit_message>
updates dates for May 16 HCC
</commit_message>
<xml_diff>
--- a/docs/HC Challenge XXXVIII Flyer.docx
+++ b/docs/HC Challenge XXXVIII Flyer.docx
@@ -305,7 +305,7 @@
           <w:sz w:val="22"/>
           <w:szCs w:val="22"/>
         </w:rPr>
-        <w:t>5</w:t>
+        <w:t>6</w:t>
       </w:r>
     </w:p>
     <w:p>
@@ -899,7 +899,7 @@
           <w:i/>
           <w:iCs/>
         </w:rPr>
-        <w:t xml:space="preserve">September </w:t>
+        <w:t>April</w:t>
       </w:r>
       <w:r>
         <w:rPr>
@@ -907,7 +907,7 @@
           <w:i/>
           <w:iCs/>
         </w:rPr>
-        <w:t>20</w:t>
+        <w:t xml:space="preserve"> </w:t>
       </w:r>
       <w:r>
         <w:rPr>
@@ -915,7 +915,7 @@
           <w:i/>
           <w:iCs/>
         </w:rPr>
-        <w:t>, 202</w:t>
+        <w:t>15</w:t>
       </w:r>
       <w:r>
         <w:rPr>
@@ -923,7 +923,15 @@
           <w:i/>
           <w:iCs/>
         </w:rPr>
-        <w:t>5</w:t>
+        <w:t>, 202</w:t>
+      </w:r>
+      <w:r>
+        <w:rPr>
+          <w:rFonts w:ascii="Arial" w:hAnsi="Arial" w:cs="Arial"/>
+          <w:i/>
+          <w:iCs/>
+        </w:rPr>
+        <w:t>6</w:t>
       </w:r>
       <w:r>
         <w:rPr>
@@ -1128,7 +1136,7 @@
           <w:sz w:val="22"/>
           <w:szCs w:val="22"/>
         </w:rPr>
-        <w:t>14</w:t>
+        <w:t>08</w:t>
       </w:r>
       <w:r>
         <w:rPr>

</xml_diff>